<commit_message>
Extend Confined Space lesson plan to 5 days with assessment on Day 5
Co-Authored-By: Claude Opus 5.5 <noreply@anthropic.com>
Claude-Session: https://claude.ai/code/session_01Hb2Bu7wKyZLwpAerXW8Etx
</commit_message>
<xml_diff>
--- a/Lesson_Plan_Confined_Space_Petrofac_TMG.docx
+++ b/Lesson_Plan_Confined_Space_Petrofac_TMG.docx
@@ -622,7 +622,7 @@
                 <w:bCs/>
                 <w:color w:val="000000" w:themeColor="text1"/>
               </w:rPr>
-              <w:t xml:space="preserve">4 days</w:t>
+              <w:t xml:space="preserve">5 days</w:t>
             </w:r>
           </w:p>
         </w:tc>
@@ -753,7 +753,7 @@
                 <w:bCs/>
                 <w:color w:val="000000" w:themeColor="text1"/>
               </w:rPr>
-              <w:t xml:space="preserve">4</w:t>
+              <w:t xml:space="preserve">5</w:t>
             </w:r>
           </w:p>
         </w:tc>
@@ -2407,21 +2407,6 @@
               <w:t xml:space="preserve">Atmospheric Hazards</w:t>
             </w:r>
           </w:p>
-          <w:p>
-            <w:pPr>
-              <w:pStyle w:val="NoSpacing"/>
-              <w:numPr>
-                <w:ilvl w:val="0"/>
-                <w:numId w:val="3"/>
-              </w:numPr>
-              <w:rPr>
-                <w:rFonts w:cs="Arial"/>
-              </w:rPr>
-            </w:pPr>
-            <w:r>
-              <w:t xml:space="preserve">Engulfment</w:t>
-            </w:r>
-          </w:p>
         </w:tc>
         <w:tc>
           <w:tcPr>
@@ -2548,6 +2533,21 @@
             <w:gridSpan w:val="2"/>
             <w:vAlign w:val="center"/>
           </w:tcPr>
+          <w:p>
+            <w:pPr>
+              <w:pStyle w:val="NoSpacing"/>
+              <w:numPr>
+                <w:ilvl w:val="0"/>
+                <w:numId w:val="3"/>
+              </w:numPr>
+              <w:rPr>
+                <w:rFonts w:cs="Arial"/>
+              </w:rPr>
+            </w:pPr>
+            <w:r>
+              <w:t xml:space="preserve">Engulfment</w:t>
+            </w:r>
+          </w:p>
           <w:p>
             <w:pPr>
               <w:pStyle w:val="NoSpacing"/>
@@ -3157,36 +3157,6 @@
               <w:t xml:space="preserve">Safe Isolation &amp; Reinstatement of Plant</w:t>
             </w:r>
           </w:p>
-          <w:p>
-            <w:pPr>
-              <w:pStyle w:val="NoSpacing"/>
-              <w:numPr>
-                <w:ilvl w:val="0"/>
-                <w:numId w:val="3"/>
-              </w:numPr>
-              <w:rPr>
-                <w:rFonts w:cs="Arial"/>
-              </w:rPr>
-            </w:pPr>
-            <w:r>
-              <w:t xml:space="preserve">Gas Testing</w:t>
-            </w:r>
-          </w:p>
-          <w:p>
-            <w:pPr>
-              <w:pStyle w:val="NoSpacing"/>
-              <w:numPr>
-                <w:ilvl w:val="0"/>
-                <w:numId w:val="3"/>
-              </w:numPr>
-              <w:rPr>
-                <w:rFonts w:cs="Arial"/>
-              </w:rPr>
-            </w:pPr>
-            <w:r>
-              <w:t xml:space="preserve">Access &amp; Egress</w:t>
-            </w:r>
-          </w:p>
         </w:tc>
         <w:tc>
           <w:tcPr>
@@ -3325,7 +3295,7 @@
               </w:rPr>
             </w:pPr>
             <w:r>
-              <w:t xml:space="preserve">Breathing Apparatus</w:t>
+              <w:t xml:space="preserve">Gas Testing</w:t>
             </w:r>
           </w:p>
           <w:p>
@@ -3340,37 +3310,7 @@
               </w:rPr>
             </w:pPr>
             <w:r>
-              <w:t xml:space="preserve">Communications</w:t>
-            </w:r>
-          </w:p>
-          <w:p>
-            <w:pPr>
-              <w:pStyle w:val="NoSpacing"/>
-              <w:numPr>
-                <w:ilvl w:val="0"/>
-                <w:numId w:val="3"/>
-              </w:numPr>
-              <w:rPr>
-                <w:rFonts w:cs="Arial"/>
-              </w:rPr>
-            </w:pPr>
-            <w:r>
-              <w:t xml:space="preserve">PPE</w:t>
-            </w:r>
-          </w:p>
-          <w:p>
-            <w:pPr>
-              <w:pStyle w:val="NoSpacing"/>
-              <w:numPr>
-                <w:ilvl w:val="0"/>
-                <w:numId w:val="3"/>
-              </w:numPr>
-              <w:rPr>
-                <w:rFonts w:cs="Arial"/>
-              </w:rPr>
-            </w:pPr>
-            <w:r>
-              <w:t xml:space="preserve">Ventilation</w:t>
+              <w:t xml:space="preserve">Access &amp; Egress</w:t>
             </w:r>
           </w:p>
         </w:tc>
@@ -3739,7 +3679,7 @@
               <w:rPr>
                 <w:rFonts w:cs="Arial"/>
               </w:rPr>
-              <w:t xml:space="preserve">Safe Working Practices During CSE</w:t>
+              <w:t xml:space="preserve">Permitted Confined Space Entry Preparation</w:t>
             </w:r>
           </w:p>
         </w:tc>
@@ -3761,7 +3701,7 @@
               </w:rPr>
             </w:pPr>
             <w:r>
-              <w:t xml:space="preserve">Hazardous Substances</w:t>
+              <w:t xml:space="preserve">Breathing Apparatus</w:t>
             </w:r>
           </w:p>
           <w:p>
@@ -3776,37 +3716,7 @@
               </w:rPr>
             </w:pPr>
             <w:r>
-              <w:t xml:space="preserve">Gas Welding &amp; Cutting</w:t>
-            </w:r>
-          </w:p>
-          <w:p>
-            <w:pPr>
-              <w:pStyle w:val="NoSpacing"/>
-              <w:numPr>
-                <w:ilvl w:val="0"/>
-                <w:numId w:val="3"/>
-              </w:numPr>
-              <w:rPr>
-                <w:rFonts w:cs="Arial"/>
-              </w:rPr>
-            </w:pPr>
-            <w:r>
-              <w:t xml:space="preserve">Permit Durations</w:t>
-            </w:r>
-          </w:p>
-          <w:p>
-            <w:pPr>
-              <w:pStyle w:val="NoSpacing"/>
-              <w:numPr>
-                <w:ilvl w:val="0"/>
-                <w:numId w:val="3"/>
-              </w:numPr>
-              <w:rPr>
-                <w:rFonts w:cs="Arial"/>
-              </w:rPr>
-            </w:pPr>
-            <w:r>
-              <w:t xml:space="preserve">Changing Working Conditions</w:t>
+              <w:t xml:space="preserve">Communications</w:t>
             </w:r>
           </w:p>
         </w:tc>
@@ -3925,7 +3835,7 @@
               <w:rPr>
                 <w:rFonts w:cs="Arial"/>
               </w:rPr>
-              <w:t xml:space="preserve">Emergency &amp; Rescue Arrangements</w:t>
+              <w:t xml:space="preserve">Permitted Confined Space Entry Preparation</w:t>
             </w:r>
           </w:p>
         </w:tc>
@@ -3947,7 +3857,7 @@
               </w:rPr>
             </w:pPr>
             <w:r>
-              <w:t xml:space="preserve">Rescue Plan</w:t>
+              <w:t xml:space="preserve">PPE</w:t>
             </w:r>
           </w:p>
           <w:p>
@@ -3962,7 +3872,7 @@
               </w:rPr>
             </w:pPr>
             <w:r>
-              <w:t xml:space="preserve">Emergency Arrangements &amp; Rescue Procedures</w:t>
+              <w:t xml:space="preserve">Ventilation</w:t>
             </w:r>
           </w:p>
         </w:tc>
@@ -4081,7 +3991,7 @@
               <w:rPr>
                 <w:rFonts w:cs="Arial"/>
               </w:rPr>
-              <w:t xml:space="preserve">Training &amp; Competency</w:t>
+              <w:t xml:space="preserve">Safe Working Practices During CSE</w:t>
             </w:r>
           </w:p>
         </w:tc>
@@ -4103,7 +4013,7 @@
               </w:rPr>
             </w:pPr>
             <w:r>
-              <w:t xml:space="preserve">Training Requirements</w:t>
+              <w:t xml:space="preserve">Hazardous Substances</w:t>
             </w:r>
           </w:p>
           <w:p>
@@ -4118,7 +4028,7 @@
               </w:rPr>
             </w:pPr>
             <w:r>
-              <w:t xml:space="preserve">Competency Management</w:t>
+              <w:t xml:space="preserve">Gas Welding &amp; Cutting</w:t>
             </w:r>
           </w:p>
           <w:p>
@@ -4133,7 +4043,7 @@
               </w:rPr>
             </w:pPr>
             <w:r>
-              <w:t xml:space="preserve">Integrity Management Competencies</w:t>
+              <w:t xml:space="preserve">Permit Durations</w:t>
             </w:r>
           </w:p>
           <w:p>
@@ -4148,7 +4058,7 @@
               </w:rPr>
             </w:pPr>
             <w:r>
-              <w:t xml:space="preserve">Training &amp; Competency Records Management</w:t>
+              <w:t xml:space="preserve">Changing Working Conditions</w:t>
             </w:r>
           </w:p>
         </w:tc>
@@ -4513,7 +4423,7 @@
               <w:rPr>
                 <w:rFonts w:cs="Arial"/>
               </w:rPr>
-              <w:t xml:space="preserve">Auxiliary Equipment</w:t>
+              <w:t xml:space="preserve">Emergency &amp; Rescue Arrangements</w:t>
             </w:r>
           </w:p>
         </w:tc>
@@ -4535,7 +4445,7 @@
               </w:rPr>
             </w:pPr>
             <w:r>
-              <w:t xml:space="preserve">Entry &amp; Exit</w:t>
+              <w:t xml:space="preserve">Rescue Plan</w:t>
             </w:r>
           </w:p>
           <w:p>
@@ -4550,37 +4460,7 @@
               </w:rPr>
             </w:pPr>
             <w:r>
-              <w:t xml:space="preserve">Retrieval Equipment</w:t>
-            </w:r>
-          </w:p>
-          <w:p>
-            <w:pPr>
-              <w:pStyle w:val="NoSpacing"/>
-              <w:numPr>
-                <w:ilvl w:val="0"/>
-                <w:numId w:val="3"/>
-              </w:numPr>
-              <w:rPr>
-                <w:rFonts w:cs="Arial"/>
-              </w:rPr>
-            </w:pPr>
-            <w:r>
-              <w:t xml:space="preserve">Fall Protection</w:t>
-            </w:r>
-          </w:p>
-          <w:p>
-            <w:pPr>
-              <w:pStyle w:val="NoSpacing"/>
-              <w:numPr>
-                <w:ilvl w:val="0"/>
-                <w:numId w:val="3"/>
-              </w:numPr>
-              <w:rPr>
-                <w:rFonts w:cs="Arial"/>
-              </w:rPr>
-            </w:pPr>
-            <w:r>
-              <w:t xml:space="preserve">Electrical Equipment</w:t>
+              <w:t xml:space="preserve">Emergency Arrangements &amp; Rescue Procedures</w:t>
             </w:r>
           </w:p>
         </w:tc>
@@ -4679,7 +4559,7 @@
               <w:rPr>
                 <w:rFonts w:cs="Arial"/>
               </w:rPr>
-              <w:t xml:space="preserve">09:40 – 10:05</w:t>
+              <w:t xml:space="preserve">09:40 – 10:30</w:t>
             </w:r>
           </w:p>
         </w:tc>
@@ -4699,7 +4579,7 @@
               <w:rPr>
                 <w:rFonts w:cs="Arial"/>
               </w:rPr>
-              <w:t xml:space="preserve">Recap of Overview of Confined Space, Confined Space Hazards, Roles &amp; Responsibilities, Permitted Confined Space Entry Preparation</w:t>
+              <w:t xml:space="preserve">Training &amp; Competency</w:t>
             </w:r>
           </w:p>
         </w:tc>
@@ -4721,7 +4601,52 @@
               </w:rPr>
             </w:pPr>
             <w:r>
-              <w:t xml:space="preserve">Technical Queries and answering them with open forum discussions.</w:t>
+              <w:t xml:space="preserve">Training Requirements</w:t>
+            </w:r>
+          </w:p>
+          <w:p>
+            <w:pPr>
+              <w:pStyle w:val="NoSpacing"/>
+              <w:numPr>
+                <w:ilvl w:val="0"/>
+                <w:numId w:val="3"/>
+              </w:numPr>
+              <w:rPr>
+                <w:rFonts w:cs="Arial"/>
+              </w:rPr>
+            </w:pPr>
+            <w:r>
+              <w:t xml:space="preserve">Competency Management</w:t>
+            </w:r>
+          </w:p>
+          <w:p>
+            <w:pPr>
+              <w:pStyle w:val="NoSpacing"/>
+              <w:numPr>
+                <w:ilvl w:val="0"/>
+                <w:numId w:val="3"/>
+              </w:numPr>
+              <w:rPr>
+                <w:rFonts w:cs="Arial"/>
+              </w:rPr>
+            </w:pPr>
+            <w:r>
+              <w:t xml:space="preserve">Integrity Management Competencies</w:t>
+            </w:r>
+          </w:p>
+          <w:p>
+            <w:pPr>
+              <w:pStyle w:val="NoSpacing"/>
+              <w:numPr>
+                <w:ilvl w:val="0"/>
+                <w:numId w:val="3"/>
+              </w:numPr>
+              <w:rPr>
+                <w:rFonts w:cs="Arial"/>
+              </w:rPr>
+            </w:pPr>
+            <w:r>
+              <w:t xml:space="preserve">Training &amp; Competency Records Management</w:t>
             </w:r>
           </w:p>
         </w:tc>
@@ -4748,6 +4673,7 @@
         <w:tc>
           <w:tcPr>
             <w:tcW w:w="1976" w:type="dxa"/>
+            <w:shd w:val="clear" w:color="auto" w:fill="2E74B5" w:themeFill="accent5" w:themeFillShade="BF"/>
             <w:vAlign w:val="center"/>
           </w:tcPr>
           <w:p>
@@ -4756,69 +4682,43 @@
               <w:jc w:val="center"/>
               <w:rPr>
                 <w:rFonts w:cs="Arial"/>
-              </w:rPr>
-            </w:pPr>
-            <w:r>
-              <w:rPr>
-                <w:rFonts w:cs="Arial"/>
-              </w:rPr>
-              <w:t xml:space="preserve">10:05 – 10:30</w:t>
-            </w:r>
-          </w:p>
-        </w:tc>
-        <w:tc>
-          <w:tcPr>
-            <w:tcW w:w="3963" w:type="dxa"/>
-            <w:vAlign w:val="center"/>
-          </w:tcPr>
-          <w:p>
-            <w:pPr>
-              <w:pStyle w:val="NoSpacing"/>
-              <w:rPr>
-                <w:rFonts w:cs="Arial"/>
-              </w:rPr>
-            </w:pPr>
-            <w:r>
-              <w:rPr>
-                <w:rFonts w:cs="Arial"/>
-              </w:rPr>
-              <w:t xml:space="preserve">Recap of Safe Working Practices During CSE, Emergency &amp; Rescue Arrangements, Training &amp; Competency, Auxiliary Equipment</w:t>
-            </w:r>
-          </w:p>
-        </w:tc>
-        <w:tc>
-          <w:tcPr>
-            <w:tcW w:w="6926" w:type="dxa"/>
-            <w:gridSpan w:val="2"/>
-            <w:vAlign w:val="center"/>
-          </w:tcPr>
-          <w:p>
-            <w:pPr>
-              <w:pStyle w:val="NoSpacing"/>
-              <w:numPr>
-                <w:ilvl w:val="0"/>
-                <w:numId w:val="3"/>
-              </w:numPr>
-              <w:rPr>
-                <w:rFonts w:cs="Arial"/>
-              </w:rPr>
-            </w:pPr>
-            <w:r>
-              <w:t xml:space="preserve">Technical Queries and answering them with open forum discussions.</w:t>
-            </w:r>
-          </w:p>
-        </w:tc>
-        <w:tc>
-          <w:tcPr>
-            <w:tcW w:w="1062" w:type="dxa"/>
-            <w:gridSpan w:val="2"/>
-            <w:vAlign w:val="center"/>
-          </w:tcPr>
-          <w:p>
-            <w:pPr>
-              <w:pStyle w:val="NoSpacing"/>
+                <w:color w:val="FFFFFF" w:themeColor="background1"/>
+              </w:rPr>
+            </w:pPr>
+            <w:r>
+              <w:rPr>
+                <w:rFonts w:cs="Arial"/>
+                <w:color w:val="FFFFFF" w:themeColor="background1"/>
+              </w:rPr>
+              <w:t xml:space="preserve">10:30 – 10:40</w:t>
+            </w:r>
+          </w:p>
+        </w:tc>
+        <w:tc>
+          <w:tcPr>
+            <w:tcW w:w="11951" w:type="dxa"/>
+            <w:gridSpan w:val="5"/>
+            <w:shd w:val="clear" w:color="auto" w:fill="2E74B5" w:themeFill="accent5" w:themeFillShade="BF"/>
+            <w:vAlign w:val="center"/>
+          </w:tcPr>
+          <w:p>
+            <w:pPr>
+              <w:pStyle w:val="NoSpacing"/>
+              <w:ind w:left="360"/>
               <w:jc w:val="center"/>
-            </w:pPr>
+              <w:rPr>
+                <w:b/>
+                <w:bCs/>
+              </w:rPr>
+            </w:pPr>
+            <w:r>
+              <w:rPr>
+                <w:b/>
+                <w:bCs/>
+                <w:color w:val="FFFFFF" w:themeColor="background1"/>
+              </w:rPr>
+              <w:t>Tea / Coffee Break</w:t>
+            </w:r>
           </w:p>
         </w:tc>
       </w:tr>
@@ -4831,7 +4731,6 @@
         <w:tc>
           <w:tcPr>
             <w:tcW w:w="1976" w:type="dxa"/>
-            <w:shd w:val="clear" w:color="auto" w:fill="2E74B5" w:themeFill="accent5" w:themeFillShade="BF"/>
             <w:vAlign w:val="center"/>
           </w:tcPr>
           <w:p>
@@ -4840,43 +4739,114 @@
               <w:jc w:val="center"/>
               <w:rPr>
                 <w:rFonts w:cs="Arial"/>
-                <w:color w:val="FFFFFF" w:themeColor="background1"/>
-              </w:rPr>
-            </w:pPr>
-            <w:r>
-              <w:rPr>
-                <w:rFonts w:cs="Arial"/>
-                <w:color w:val="FFFFFF" w:themeColor="background1"/>
-              </w:rPr>
-              <w:t xml:space="preserve">10:30 – 10:40</w:t>
-            </w:r>
-          </w:p>
-        </w:tc>
-        <w:tc>
-          <w:tcPr>
-            <w:tcW w:w="11951" w:type="dxa"/>
-            <w:gridSpan w:val="5"/>
-            <w:shd w:val="clear" w:color="auto" w:fill="2E74B5" w:themeFill="accent5" w:themeFillShade="BF"/>
-            <w:vAlign w:val="center"/>
-          </w:tcPr>
-          <w:p>
-            <w:pPr>
-              <w:pStyle w:val="NoSpacing"/>
-              <w:ind w:left="360"/>
+              </w:rPr>
+            </w:pPr>
+            <w:r>
+              <w:rPr>
+                <w:rFonts w:cs="Arial"/>
+              </w:rPr>
+              <w:t xml:space="preserve">10:40 – 11:30</w:t>
+            </w:r>
+          </w:p>
+        </w:tc>
+        <w:tc>
+          <w:tcPr>
+            <w:tcW w:w="3963" w:type="dxa"/>
+            <w:vAlign w:val="center"/>
+          </w:tcPr>
+          <w:p>
+            <w:pPr>
+              <w:pStyle w:val="NoSpacing"/>
+              <w:rPr>
+                <w:rFonts w:cs="Arial"/>
+              </w:rPr>
+            </w:pPr>
+            <w:r>
+              <w:rPr>
+                <w:rFonts w:cs="Arial"/>
+              </w:rPr>
+              <w:t xml:space="preserve">Auxiliary Equipment</w:t>
+            </w:r>
+          </w:p>
+        </w:tc>
+        <w:tc>
+          <w:tcPr>
+            <w:tcW w:w="6926" w:type="dxa"/>
+            <w:gridSpan w:val="2"/>
+            <w:vAlign w:val="center"/>
+          </w:tcPr>
+          <w:p>
+            <w:pPr>
+              <w:pStyle w:val="NoSpacing"/>
+              <w:numPr>
+                <w:ilvl w:val="0"/>
+                <w:numId w:val="3"/>
+              </w:numPr>
+              <w:rPr>
+                <w:rFonts w:cs="Arial"/>
+              </w:rPr>
+            </w:pPr>
+            <w:r>
+              <w:t xml:space="preserve">Entry &amp; Exit</w:t>
+            </w:r>
+          </w:p>
+          <w:p>
+            <w:pPr>
+              <w:pStyle w:val="NoSpacing"/>
+              <w:numPr>
+                <w:ilvl w:val="0"/>
+                <w:numId w:val="3"/>
+              </w:numPr>
+              <w:rPr>
+                <w:rFonts w:cs="Arial"/>
+              </w:rPr>
+            </w:pPr>
+            <w:r>
+              <w:t xml:space="preserve">Retrieval Equipment</w:t>
+            </w:r>
+          </w:p>
+          <w:p>
+            <w:pPr>
+              <w:pStyle w:val="NoSpacing"/>
+              <w:numPr>
+                <w:ilvl w:val="0"/>
+                <w:numId w:val="3"/>
+              </w:numPr>
+              <w:rPr>
+                <w:rFonts w:cs="Arial"/>
+              </w:rPr>
+            </w:pPr>
+            <w:r>
+              <w:t xml:space="preserve">Fall Protection</w:t>
+            </w:r>
+          </w:p>
+          <w:p>
+            <w:pPr>
+              <w:pStyle w:val="NoSpacing"/>
+              <w:numPr>
+                <w:ilvl w:val="0"/>
+                <w:numId w:val="3"/>
+              </w:numPr>
+              <w:rPr>
+                <w:rFonts w:cs="Arial"/>
+              </w:rPr>
+            </w:pPr>
+            <w:r>
+              <w:t xml:space="preserve">Electrical Equipment</w:t>
+            </w:r>
+          </w:p>
+        </w:tc>
+        <w:tc>
+          <w:tcPr>
+            <w:tcW w:w="1062" w:type="dxa"/>
+            <w:gridSpan w:val="2"/>
+            <w:vAlign w:val="center"/>
+          </w:tcPr>
+          <w:p>
+            <w:pPr>
+              <w:pStyle w:val="NoSpacing"/>
               <w:jc w:val="center"/>
-              <w:rPr>
-                <w:b/>
-                <w:bCs/>
-              </w:rPr>
-            </w:pPr>
-            <w:r>
-              <w:rPr>
-                <w:b/>
-                <w:bCs/>
-                <w:color w:val="FFFFFF" w:themeColor="background1"/>
-              </w:rPr>
-              <w:t>Tea / Coffee Break</w:t>
-            </w:r>
+            </w:pPr>
           </w:p>
         </w:tc>
       </w:tr>
@@ -4889,6 +4859,7 @@
         <w:tc>
           <w:tcPr>
             <w:tcW w:w="1976" w:type="dxa"/>
+            <w:shd w:val="clear" w:color="auto" w:fill="2E74B5" w:themeFill="accent5" w:themeFillShade="BF"/>
             <w:vAlign w:val="center"/>
           </w:tcPr>
           <w:p>
@@ -4899,11 +4870,599 @@
                 <w:rFonts w:cs="Arial"/>
               </w:rPr>
             </w:pPr>
-            <w:r>
-              <w:rPr>
-                <w:rFonts w:cs="Arial"/>
-              </w:rPr>
-              <w:t xml:space="preserve">10:40 – 11:30</w:t>
+          </w:p>
+        </w:tc>
+        <w:tc>
+          <w:tcPr>
+            <w:tcW w:w="11951" w:type="dxa"/>
+            <w:gridSpan w:val="5"/>
+            <w:shd w:val="clear" w:color="auto" w:fill="2E74B5" w:themeFill="accent5" w:themeFillShade="BF"/>
+            <w:vAlign w:val="center"/>
+          </w:tcPr>
+          <w:p>
+            <w:pPr>
+              <w:pStyle w:val="NoSpacing"/>
+              <w:rPr>
+                <w:rFonts w:cs="Arial"/>
+                <w:b/>
+                <w:bCs/>
+              </w:rPr>
+            </w:pPr>
+            <w:r>
+              <w:rPr>
+                <w:rFonts w:cs="Arial"/>
+                <w:b/>
+                <w:bCs/>
+                <w:color w:val="FFFFFF" w:themeColor="background1"/>
+              </w:rPr>
+              <w:t xml:space="preserve">                                                       End of the training day</w:t>
+            </w:r>
+          </w:p>
+        </w:tc>
+      </w:tr>
+    </w:tbl>
+    <w:p>
+      <w:pPr>
+        <w:rPr>
+          <w:b/>
+          <w:bCs/>
+          <w:color w:val="0070C0"/>
+          <w:sz w:val="28"/>
+          <w:szCs w:val="28"/>
+        </w:rPr>
+      </w:pPr>
+    </w:p>
+    <w:p>
+      <w:pPr>
+        <w:rPr>
+          <w:b/>
+          <w:bCs/>
+          <w:color w:val="0070C0"/>
+          <w:sz w:val="28"/>
+          <w:szCs w:val="28"/>
+        </w:rPr>
+      </w:pPr>
+    </w:p>
+    <w:p>
+      <w:pPr>
+        <w:rPr>
+          <w:b/>
+          <w:bCs/>
+          <w:color w:val="0070C0"/>
+          <w:sz w:val="28"/>
+          <w:szCs w:val="28"/>
+        </w:rPr>
+      </w:pPr>
+    </w:p>
+    <w:p>
+      <w:pPr>
+        <w:rPr>
+          <w:b/>
+          <w:bCs/>
+          <w:color w:val="0070C0"/>
+          <w:sz w:val="28"/>
+          <w:szCs w:val="28"/>
+        </w:rPr>
+      </w:pPr>
+    </w:p>
+    <w:p>
+      <w:pPr>
+        <w:rPr>
+          <w:b/>
+          <w:bCs/>
+          <w:color w:val="0070C0"/>
+          <w:sz w:val="28"/>
+          <w:szCs w:val="28"/>
+        </w:rPr>
+      </w:pPr>
+      <w:r>
+        <w:rPr>
+          <w:b/>
+          <w:bCs/>
+          <w:color w:val="0070C0"/>
+          <w:sz w:val="28"/>
+          <w:szCs w:val="28"/>
+        </w:rPr>
+        <w:lastRenderedPageBreak/>
+        <w:t xml:space="preserve">Classroom Session – Day 5      </w:t>
+      </w:r>
+      <w:r>
+        <w:rPr>
+          <w:b/>
+          <w:bCs/>
+          <w:sz w:val="28"/>
+          <w:szCs w:val="28"/>
+        </w:rPr>
+        <w:t xml:space="preserve">                        </w:t>
+      </w:r>
+    </w:p>
+    <w:p>
+      <w:pPr>
+        <w:rPr>
+          <w:b/>
+          <w:bCs/>
+          <w:sz w:val="28"/>
+          <w:szCs w:val="28"/>
+        </w:rPr>
+      </w:pPr>
+    </w:p>
+    <w:tbl>
+      <w:tblPr>
+        <w:tblStyle w:val="TableGrid"/>
+        <w:tblW w:w="13996" w:type="dxa"/>
+        <w:tblLayout w:type="fixed"/>
+        <w:tblLook w:val="04A0" w:firstRow="1" w:lastRow="0" w:firstColumn="1" w:lastColumn="0" w:noHBand="0" w:noVBand="1"/>
+      </w:tblPr>
+      <w:tblGrid>
+        <w:gridCol w:w="1976"/>
+        <w:gridCol w:w="3963"/>
+        <w:gridCol w:w="69"/>
+        <w:gridCol w:w="6857"/>
+        <w:gridCol w:w="69"/>
+        <w:gridCol w:w="993"/>
+        <w:gridCol w:w="69"/>
+      </w:tblGrid>
+      <w:tr>
+        <w:trPr>
+          <w:gridAfter w:val="1"/>
+          <w:cnfStyle w:val="100000000000" w:firstRow="1" w:lastRow="0" w:firstColumn="0" w:lastColumn="0" w:oddVBand="0" w:evenVBand="0" w:oddHBand="0" w:evenHBand="0" w:firstRowFirstColumn="0" w:firstRowLastColumn="0" w:lastRowFirstColumn="0" w:lastRowLastColumn="0"/>
+          <w:wAfter w:w="69" w:type="dxa"/>
+          <w:trHeight w:val="720"/>
+          <w:tblHeader/>
+        </w:trPr>
+        <w:tc>
+          <w:tcPr>
+            <w:tcW w:w="1976" w:type="dxa"/>
+          </w:tcPr>
+          <w:p>
+            <w:pPr>
+              <w:pStyle w:val="NoSpacing"/>
+              <w:rPr>
+                <w:rFonts w:cs="Arial"/>
+              </w:rPr>
+            </w:pPr>
+            <w:r>
+              <w:rPr>
+                <w:rFonts w:cs="Arial"/>
+              </w:rPr>
+              <w:t>Time</w:t>
+            </w:r>
+          </w:p>
+        </w:tc>
+        <w:tc>
+          <w:tcPr>
+            <w:tcW w:w="3963" w:type="dxa"/>
+          </w:tcPr>
+          <w:p>
+            <w:pPr>
+              <w:pStyle w:val="NoSpacing"/>
+              <w:rPr>
+                <w:rFonts w:cs="Arial"/>
+              </w:rPr>
+            </w:pPr>
+            <w:r>
+              <w:rPr>
+                <w:rFonts w:cs="Arial"/>
+              </w:rPr>
+              <w:t>Description</w:t>
+            </w:r>
+          </w:p>
+        </w:tc>
+        <w:tc>
+          <w:tcPr>
+            <w:tcW w:w="6926" w:type="dxa"/>
+            <w:gridSpan w:val="2"/>
+          </w:tcPr>
+          <w:p>
+            <w:pPr>
+              <w:pStyle w:val="NoSpacing"/>
+            </w:pPr>
+            <w:r>
+              <w:t>Comments</w:t>
+            </w:r>
+          </w:p>
+        </w:tc>
+        <w:tc>
+          <w:tcPr>
+            <w:tcW w:w="1062" w:type="dxa"/>
+            <w:gridSpan w:val="2"/>
+          </w:tcPr>
+          <w:p>
+            <w:pPr>
+              <w:pStyle w:val="NoSpacing"/>
+            </w:pPr>
+          </w:p>
+        </w:tc>
+      </w:tr>
+      <w:tr>
+        <w:trPr>
+          <w:gridAfter w:val="1"/>
+          <w:wAfter w:w="69" w:type="dxa"/>
+          <w:trHeight w:val="720"/>
+        </w:trPr>
+        <w:tc>
+          <w:tcPr>
+            <w:tcW w:w="1976" w:type="dxa"/>
+            <w:vAlign w:val="center"/>
+          </w:tcPr>
+          <w:p>
+            <w:pPr>
+              <w:pStyle w:val="NoSpacing"/>
+              <w:jc w:val="center"/>
+              <w:rPr>
+                <w:rFonts w:cs="Arial"/>
+              </w:rPr>
+            </w:pPr>
+            <w:r>
+              <w:rPr>
+                <w:rFonts w:cs="Arial"/>
+              </w:rPr>
+              <w:t xml:space="preserve">08:30 – 08:40</w:t>
+            </w:r>
+          </w:p>
+        </w:tc>
+        <w:tc>
+          <w:tcPr>
+            <w:tcW w:w="3963" w:type="dxa"/>
+            <w:vAlign w:val="center"/>
+          </w:tcPr>
+          <w:p>
+            <w:pPr>
+              <w:pStyle w:val="NoSpacing"/>
+              <w:rPr>
+                <w:rFonts w:cs="Arial"/>
+              </w:rPr>
+            </w:pPr>
+            <w:r>
+              <w:rPr>
+                <w:rFonts w:cs="Arial"/>
+              </w:rPr>
+              <w:t xml:space="preserve">Safety Talk &amp; Recap of Day-4 Session</w:t>
+            </w:r>
+          </w:p>
+        </w:tc>
+        <w:tc>
+          <w:tcPr>
+            <w:tcW w:w="6926" w:type="dxa"/>
+            <w:gridSpan w:val="2"/>
+            <w:vAlign w:val="center"/>
+          </w:tcPr>
+          <w:p>
+            <w:pPr>
+              <w:pStyle w:val="NoSpacing"/>
+              <w:numPr>
+                <w:ilvl w:val="0"/>
+                <w:numId w:val="3"/>
+              </w:numPr>
+              <w:rPr>
+                <w:rFonts w:cs="Arial"/>
+              </w:rPr>
+            </w:pPr>
+            <w:r>
+              <w:t xml:space="preserve">Safety Talk &amp; Recap of Day-4 Session</w:t>
+            </w:r>
+          </w:p>
+        </w:tc>
+        <w:tc>
+          <w:tcPr>
+            <w:tcW w:w="1062" w:type="dxa"/>
+            <w:gridSpan w:val="2"/>
+            <w:vAlign w:val="center"/>
+          </w:tcPr>
+          <w:p>
+            <w:pPr>
+              <w:pStyle w:val="NoSpacing"/>
+              <w:jc w:val="center"/>
+            </w:pPr>
+          </w:p>
+        </w:tc>
+      </w:tr>
+      <w:tr>
+        <w:trPr>
+          <w:gridAfter w:val="1"/>
+          <w:wAfter w:w="69" w:type="dxa"/>
+          <w:trHeight w:val="720"/>
+        </w:trPr>
+        <w:tc>
+          <w:tcPr>
+            <w:tcW w:w="1976" w:type="dxa"/>
+            <w:vAlign w:val="center"/>
+          </w:tcPr>
+          <w:p>
+            <w:pPr>
+              <w:pStyle w:val="NoSpacing"/>
+              <w:jc w:val="center"/>
+              <w:rPr>
+                <w:rFonts w:cs="Arial"/>
+              </w:rPr>
+            </w:pPr>
+            <w:r>
+              <w:rPr>
+                <w:rFonts w:cs="Arial"/>
+              </w:rPr>
+              <w:t xml:space="preserve">08:40 – 09:30</w:t>
+            </w:r>
+          </w:p>
+        </w:tc>
+        <w:tc>
+          <w:tcPr>
+            <w:tcW w:w="3963" w:type="dxa"/>
+            <w:vAlign w:val="center"/>
+          </w:tcPr>
+          <w:p>
+            <w:pPr>
+              <w:pStyle w:val="NoSpacing"/>
+              <w:rPr>
+                <w:rFonts w:cs="Arial"/>
+              </w:rPr>
+            </w:pPr>
+            <w:r>
+              <w:rPr>
+                <w:rFonts w:cs="Arial"/>
+              </w:rPr>
+              <w:t xml:space="preserve">Recap of Overview of Confined Space, Confined Space Hazards, Roles &amp; Responsibilities, Permitted Confined Space Entry Preparation</w:t>
+            </w:r>
+          </w:p>
+        </w:tc>
+        <w:tc>
+          <w:tcPr>
+            <w:tcW w:w="6926" w:type="dxa"/>
+            <w:gridSpan w:val="2"/>
+            <w:vAlign w:val="center"/>
+          </w:tcPr>
+          <w:p>
+            <w:pPr>
+              <w:pStyle w:val="NoSpacing"/>
+              <w:numPr>
+                <w:ilvl w:val="0"/>
+                <w:numId w:val="3"/>
+              </w:numPr>
+              <w:rPr>
+                <w:rFonts w:cs="Arial"/>
+              </w:rPr>
+            </w:pPr>
+            <w:r>
+              <w:t xml:space="preserve">Technical Queries and answering them with open forum discussions.</w:t>
+            </w:r>
+          </w:p>
+        </w:tc>
+        <w:tc>
+          <w:tcPr>
+            <w:tcW w:w="1062" w:type="dxa"/>
+            <w:gridSpan w:val="2"/>
+            <w:vAlign w:val="center"/>
+          </w:tcPr>
+          <w:p>
+            <w:pPr>
+              <w:pStyle w:val="NoSpacing"/>
+              <w:jc w:val="center"/>
+            </w:pPr>
+          </w:p>
+        </w:tc>
+      </w:tr>
+      <w:tr>
+        <w:trPr>
+          <w:gridAfter w:val="1"/>
+          <w:wAfter w:w="69" w:type="dxa"/>
+          <w:trHeight w:val="720"/>
+        </w:trPr>
+        <w:tc>
+          <w:tcPr>
+            <w:tcW w:w="1976" w:type="dxa"/>
+            <w:shd w:val="clear" w:color="auto" w:fill="2E74B5" w:themeFill="accent5" w:themeFillShade="BF"/>
+            <w:vAlign w:val="center"/>
+          </w:tcPr>
+          <w:p>
+            <w:pPr>
+              <w:pStyle w:val="NoSpacing"/>
+              <w:jc w:val="center"/>
+              <w:rPr>
+                <w:rFonts w:cs="Arial"/>
+                <w:color w:val="FFFFFF" w:themeColor="background1"/>
+              </w:rPr>
+            </w:pPr>
+            <w:r>
+              <w:rPr>
+                <w:rFonts w:cs="Arial"/>
+                <w:color w:val="FFFFFF" w:themeColor="background1"/>
+              </w:rPr>
+              <w:t xml:space="preserve">09:30 – 09:40</w:t>
+            </w:r>
+          </w:p>
+        </w:tc>
+        <w:tc>
+          <w:tcPr>
+            <w:tcW w:w="11951" w:type="dxa"/>
+            <w:gridSpan w:val="5"/>
+            <w:shd w:val="clear" w:color="auto" w:fill="2E74B5" w:themeFill="accent5" w:themeFillShade="BF"/>
+            <w:vAlign w:val="center"/>
+          </w:tcPr>
+          <w:p>
+            <w:pPr>
+              <w:pStyle w:val="NoSpacing"/>
+              <w:ind w:left="360"/>
+              <w:jc w:val="center"/>
+              <w:rPr>
+                <w:b/>
+                <w:bCs/>
+              </w:rPr>
+            </w:pPr>
+            <w:r>
+              <w:rPr>
+                <w:b/>
+                <w:bCs/>
+                <w:color w:val="FFFFFF" w:themeColor="background1"/>
+              </w:rPr>
+              <w:t>Tea / Coffee Break</w:t>
+            </w:r>
+          </w:p>
+        </w:tc>
+      </w:tr>
+      <w:tr>
+        <w:trPr>
+          <w:gridAfter w:val="1"/>
+          <w:wAfter w:w="69" w:type="dxa"/>
+          <w:trHeight w:val="720"/>
+        </w:trPr>
+        <w:tc>
+          <w:tcPr>
+            <w:tcW w:w="1976" w:type="dxa"/>
+            <w:vAlign w:val="center"/>
+          </w:tcPr>
+          <w:p>
+            <w:pPr>
+              <w:pStyle w:val="NoSpacing"/>
+              <w:jc w:val="center"/>
+              <w:rPr>
+                <w:rFonts w:cs="Arial"/>
+              </w:rPr>
+            </w:pPr>
+            <w:r>
+              <w:rPr>
+                <w:rFonts w:cs="Arial"/>
+              </w:rPr>
+              <w:t xml:space="preserve">09:40 – 10:20</w:t>
+            </w:r>
+          </w:p>
+        </w:tc>
+        <w:tc>
+          <w:tcPr>
+            <w:tcW w:w="3963" w:type="dxa"/>
+            <w:vAlign w:val="center"/>
+          </w:tcPr>
+          <w:p>
+            <w:pPr>
+              <w:pStyle w:val="NoSpacing"/>
+              <w:rPr>
+                <w:rFonts w:cs="Arial"/>
+              </w:rPr>
+            </w:pPr>
+            <w:r>
+              <w:rPr>
+                <w:rFonts w:cs="Arial"/>
+              </w:rPr>
+              <w:t xml:space="preserve">Recap of Safe Working Practices During CSE, Emergency &amp; Rescue Arrangements, Training &amp; Competency, Auxiliary Equipment</w:t>
+            </w:r>
+          </w:p>
+        </w:tc>
+        <w:tc>
+          <w:tcPr>
+            <w:tcW w:w="6926" w:type="dxa"/>
+            <w:gridSpan w:val="2"/>
+            <w:vAlign w:val="center"/>
+          </w:tcPr>
+          <w:p>
+            <w:pPr>
+              <w:pStyle w:val="NoSpacing"/>
+              <w:numPr>
+                <w:ilvl w:val="0"/>
+                <w:numId w:val="3"/>
+              </w:numPr>
+              <w:rPr>
+                <w:rFonts w:cs="Arial"/>
+              </w:rPr>
+            </w:pPr>
+            <w:r>
+              <w:t xml:space="preserve">Technical Queries and answering them with open forum discussions.</w:t>
+            </w:r>
+          </w:p>
+        </w:tc>
+        <w:tc>
+          <w:tcPr>
+            <w:tcW w:w="1062" w:type="dxa"/>
+            <w:gridSpan w:val="2"/>
+            <w:vAlign w:val="center"/>
+          </w:tcPr>
+          <w:p>
+            <w:pPr>
+              <w:pStyle w:val="NoSpacing"/>
+              <w:jc w:val="center"/>
+            </w:pPr>
+          </w:p>
+        </w:tc>
+      </w:tr>
+      <w:tr>
+        <w:trPr>
+          <w:gridAfter w:val="1"/>
+          <w:wAfter w:w="69" w:type="dxa"/>
+          <w:trHeight w:val="720"/>
+        </w:trPr>
+        <w:tc>
+          <w:tcPr>
+            <w:tcW w:w="1976" w:type="dxa"/>
+            <w:shd w:val="clear" w:color="auto" w:fill="2E74B5" w:themeFill="accent5" w:themeFillShade="BF"/>
+            <w:vAlign w:val="center"/>
+          </w:tcPr>
+          <w:p>
+            <w:pPr>
+              <w:pStyle w:val="NoSpacing"/>
+              <w:jc w:val="center"/>
+              <w:rPr>
+                <w:rFonts w:cs="Arial"/>
+                <w:color w:val="FFFFFF" w:themeColor="background1"/>
+              </w:rPr>
+            </w:pPr>
+            <w:r>
+              <w:rPr>
+                <w:rFonts w:cs="Arial"/>
+                <w:color w:val="FFFFFF" w:themeColor="background1"/>
+              </w:rPr>
+              <w:t xml:space="preserve">10:20 – 10:30</w:t>
+            </w:r>
+          </w:p>
+        </w:tc>
+        <w:tc>
+          <w:tcPr>
+            <w:tcW w:w="11951" w:type="dxa"/>
+            <w:gridSpan w:val="5"/>
+            <w:shd w:val="clear" w:color="auto" w:fill="2E74B5" w:themeFill="accent5" w:themeFillShade="BF"/>
+            <w:vAlign w:val="center"/>
+          </w:tcPr>
+          <w:p>
+            <w:pPr>
+              <w:pStyle w:val="NoSpacing"/>
+              <w:ind w:left="360"/>
+              <w:jc w:val="center"/>
+              <w:rPr>
+                <w:b/>
+                <w:bCs/>
+              </w:rPr>
+            </w:pPr>
+            <w:r>
+              <w:rPr>
+                <w:b/>
+                <w:bCs/>
+                <w:color w:val="FFFFFF" w:themeColor="background1"/>
+              </w:rPr>
+              <w:t>Tea / Coffee Break</w:t>
+            </w:r>
+          </w:p>
+        </w:tc>
+      </w:tr>
+      <w:tr>
+        <w:trPr>
+          <w:gridAfter w:val="1"/>
+          <w:wAfter w:w="69" w:type="dxa"/>
+          <w:trHeight w:val="720"/>
+        </w:trPr>
+        <w:tc>
+          <w:tcPr>
+            <w:tcW w:w="1976" w:type="dxa"/>
+            <w:vAlign w:val="center"/>
+          </w:tcPr>
+          <w:p>
+            <w:pPr>
+              <w:pStyle w:val="NoSpacing"/>
+              <w:jc w:val="center"/>
+              <w:rPr>
+                <w:rFonts w:cs="Arial"/>
+              </w:rPr>
+            </w:pPr>
+            <w:r>
+              <w:rPr>
+                <w:rFonts w:cs="Arial"/>
+              </w:rPr>
+              <w:t xml:space="preserve">10:30 – 11:30</w:t>
             </w:r>
           </w:p>
         </w:tc>

</xml_diff>